<commit_message>
feat(toc): warehouse-robust PO/MR netting (count direct user POs) + docs
- _open_po_qty / _open_purchase_mr_qty match warehouse via COALESCE(line.warehouse,
  header.set_warehouse) so a user-created DIRECT Purchase Order (or MR) with only
  the header set_warehouse is netted — prevents the engine raising an unnecessary
  extra Purchase MR over supply that already exists. Verified: direct PO 0->7.
- Engine-created Purchase MRs set BOTH set_warehouse and line warehouse = the
  action's (item x warehouse) warehouse. Verified MATCH.
- Everything stays per (item x warehouse) — multi-warehouse companies have
  per-location config (the user's long-term design rationale).
- Docs: configurable_triggers.md + build_docs §6.1 + regenerated docx.

Co-Authored-By: Claude Opus 4.8 (1M context) <noreply@anthropic.com>
</commit_message>
<xml_diff>
--- a/documentation/Chaizup_TOC_Feature_Reference.docx
+++ b/documentation/Chaizup_TOC_Feature_Reference.docx
@@ -6409,6 +6409,84 @@
     </w:p>
     <w:p>
       <w:pPr>
+        <w:spacing w:after="120"/>
+      </w:pPr>
+      <w:r>
+        <w:rPr>
+          <w:b/>
+          <w:i w:val="0"/>
+          <w:sz w:val="21"/>
+        </w:rPr>
+        <w:t>Purchase Material Request netting (2026-06-04):</w:t>
+      </w:r>
+    </w:p>
+    <w:p>
+      <w:pPr>
+        <w:spacing w:after="120"/>
+      </w:pPr>
+      <w:r>
+        <w:rPr>
+          <w:b w:val="0"/>
+          <w:i w:val="0"/>
+          <w:sz w:val="21"/>
+        </w:rPr>
+        <w:t>For a purchase-mode item the engine creates a Material Request (a Purchase Order cannot be raised automatically because the supplier is the buyer's choice). To avoid re-requesting the same shortage forever, the three purchase engines (Sales Projection, Sales Order Shortage, Shortage Action) subtract the quantity already pending on open/draft Purchase Material Requests from the shortage. A fourth pending list, 'Pending Purchase Material Request Statuses', is configured globally in TOC Settings and can be overridden per trigger; it must include Draft because the engine leaves its own requests as Draft. The remaining quantity is measured as ordered minus received so a request that has become a Purchase Order is not counted twice.</w:t>
+      </w:r>
+    </w:p>
+    <w:p>
+      <w:pPr>
+        <w:spacing w:after="120"/>
+      </w:pPr>
+      <w:r>
+        <w:rPr>
+          <w:b/>
+          <w:i w:val="0"/>
+          <w:sz w:val="21"/>
+        </w:rPr>
+        <w:t>Average Daily Usage — Stock Reconciliation excluded (2026-06-04):</w:t>
+      </w:r>
+    </w:p>
+    <w:p>
+      <w:pPr>
+        <w:spacing w:after="120"/>
+      </w:pPr>
+      <w:r>
+        <w:rPr>
+          <w:b w:val="0"/>
+          <w:i w:val="0"/>
+          <w:sz w:val="21"/>
+        </w:rPr>
+        <w:t>The Average Daily Usage refresh no longer counts Stock Reconciliation outward legs (inventory corrections), only true consumption (Delivery Notes, Work Order / Stock Entry consumption, issues, transfers), so a physical-count adjustment does not inflate the buffer.</w:t>
+      </w:r>
+    </w:p>
+    <w:p>
+      <w:pPr>
+        <w:spacing w:after="120"/>
+      </w:pPr>
+      <w:r>
+        <w:rPr>
+          <w:b/>
+          <w:i w:val="0"/>
+          <w:sz w:val="21"/>
+        </w:rPr>
+        <w:t>Created-by metadata (2026-06-04):</w:t>
+      </w:r>
+    </w:p>
+    <w:p>
+      <w:pPr>
+        <w:spacing w:after="120"/>
+      </w:pPr>
+      <w:r>
+        <w:rPr>
+          <w:b w:val="0"/>
+          <w:i w:val="0"/>
+          <w:sz w:val="21"/>
+        </w:rPr>
+        <w:t>Material Requests, Production Plans and Work Orders carry a read-only 'Recorded By' (User / System) and a formatted 'Creation Reason' showing, in a small table, exactly why the document was created and the live figures the engine used. System documents are read-only; user-created ones can be edited before submit.</w:t>
+      </w:r>
+    </w:p>
+    <w:p>
+      <w:pPr>
         <w:pStyle w:val="Heading1"/>
       </w:pPr>
       <w:r>

</xml_diff>